<commit_message>
docs: regenerare raport demo cu cifre rotunjite
Co-Authored-By: Claude Opus 4.8 (1M context) <noreply@anthropic.com>
</commit_message>
<xml_diff>
--- a/docs/exemplu-raport-demo.docx
+++ b/docs/exemplu-raport-demo.docx
@@ -251,16 +251,13 @@
     </w:p>
     <w:p>
       <w:r>
-        <w:t>Prezenta evaluare a fost întocmită în scopul garantării creditului ipotecar acordat de Banca Comerciala Exemplu S.A., având ca obiect determinarea valorii de piață a proprietății imobiliare analizate, exprimată în EUR, în conformitate cu SEV 104. Raportul se bazează pe informațiile puse la dispoziție de beneficiar și pe datele rezultate din analiza specifică misiunii de evaluare, pentru anul de referință 2026.</w:t>
+        <w:t>Se pornește de la ipoteza că dreptul de proprietate asupra imobilului este valabil, transferabil și liber de sarcini, grefat de orice excepții menționate expres în prezentul raport, precum și de ipoteza că informațiile puse la dispoziție de Andrei Popescu sunt complete și corecte în limitele scopului evaluării. Totodată, se presupune că imobilul identificat la Str. Teilor nr. 14, Comarnic, jud. Prahova, înscris în 20145 și CF 20145 Comarnic, are o situație juridică și tehnică ce permite utilizarea sa în condiții normale, fără vicii ascunse care să influențeze semnificativ valoarea estimată. Evaluarea este întocmită în contextul garantării creditului ipotecar pentru Andrei Popescu, iar valoarea raportată este valoarea de piață, exprimată în EUR, conform SEV 104.</w:t>
         <w:br/>
         <w:br/>
-        <w:t>Se presupune că dreptul de proprietate asupra imobilului este valabil, opozabil și liber de sarcini, cu excepția eventualelor situații menționate expres în raport și în documentele analizate. De asemenea, se presupune că structura de rezistență a construcției este corespunzătoare, fără vicii ascunse sau deficiențe structurale care nu au putut fi identificate prin inspectarea obișnuită. Nu au fost efectuate investigații tehnice invazive, expertize ascunse sau cercetări geotehnice, iar eventualele condiții care nu pot fi constatate vizual sunt acceptate numai în limita informațiilor disponibile la data evaluării.</w:t>
+        <w:t>Se mai presupune că structura de rezistență și elementele constructive ale imobilului sunt corespunzătoare destinației și stării de exploatare observabile la data evaluării, fără a exista degradări structurale sau defecte ascunse care să poată fi identificate doar prin expertize specializate. Nu au fost efectuate investigații geotehnice, tehnice sau de laborator, iar eventualele condiții ale terenului, ale fundațiilor ori ale elementelor înglobate în construcție care nu sunt vizibile la inspecția normală sunt acceptate în baza ipotezei că acestea nu produc efecte nefavorabile asupra valorii. În mod similar, suprafața terenului de 600 mp, categoria intravilan, precum și datele privind aria utilă de 128 mp și aria construită desfășurată de 162 mp au fost preluate ca date furnizate pentru scopul prezentei evaluări și nu au făcut obiectul unei verificări topo-cadastrale complete.</w:t>
         <w:br/>
         <w:br/>
-        <w:t>Evaluarea a fost realizată pe baza datelor numerice furnizate, respectiv teren 600 mp, categorie intravilan, arie utilă 128 mp și arie construită desfășurată 162 mp. Abordările de evaluare utilizate au condus la o valoare prin cost de 153471.60000 EUR, respectiv la o valoare prin piață de 135645.0000 EUR, valoarea finală reconciliată fiind stabilită prin abordarea prin piață. Valoarea terenului determinată prin comparație este de 33721.2000 EUR, iar valoarea alocată construcției este de 101923.8000 EUR.</w:t>
-        <w:br/>
-        <w:br/>
-        <w:t>Raportul de evaluare trebuie utilizat exclusiv pentru scopul declarat în prezentul mandat și de către beneficiarul menționat, respectiv în cadrul analizei aferente garantării creditului ipotecar. Orice utilizare parțială, separată de contextul integral al raportului sau în alt scop decât cel declarat poate conduce la concluzii nefundamentate și excedează ipotezele și limitările pe baza cărora a fost elaborată prezenta lucrare.</w:t>
+        <w:t>Raportul este elaborat exclusiv pentru scopul declarat și pentru beneficiarul / finantator Andrei Popescu / Banca Comerciala Exemplu S.A., neputând fi utilizat ca bază pentru alte destinații, tranzacții sau decizii în afara celor pentru care a fost întocmit. Orice utilizare parțială, reproducere selectivă ori interpretare în alt context decât cel al garantării creditului ipotecar este interzisă fără acordul evaluatorului. Concluziile asupra valorii sunt valabile la data evaluării și în condițiile pieței aferente momentului respectiv, fără a include ipoteze privind modificări ulterioare ale cadrului legal, ale stării fizice a imobilului sau ale condițiilor de piață.</w:t>
       </w:r>
     </w:p>
     <w:p>
@@ -273,13 +270,13 @@
     </w:p>
     <w:p>
       <w:r>
-        <w:t>Piața imobiliară locală relevantă pentru proprietatea evaluată este una specifică segmentului rezidențial cu teren intravilan și construcție individuală, în care formarea prețurilor este determinată de raportul dintre cererea efectivă și oferta disponibilă în zonă, precum și de caracteristicile concrete ale proprietăților comparabile utilizate în analiză. În contextul evaluării pentru garantarea creditului ipotecar, piața a fost analizată prin raportare la comparabilele selectate, ceea ce permite surprinderea nivelului curent al prețurilor observate pentru active similare.</w:t>
+        <w:t>Piata imobiliara locala relevanta pentru imobilul evaluat este caracterizata de cerere activa pentru proprietati rezidentiale similare, sustinuta de interesul utilizatorilor finali si de achizitiile motivate de finantare ipotecara, in contextul unui numar limitat de comparabile directe disponibile. In analiza de piata au fost identificate 3 comparabile pentru valoarea intregului imobil si 3 comparabile pentru teren, ceea ce indica existenta unei baze de tranzactionare suficiente pentru fundamentarea concluziei de valoare, dar cu selectivitate ridicata a datelor utilizabile.</w:t>
         <w:br/>
         <w:br/>
-        <w:t>Din analiza datelor utilizate rezultă o piață cu lichiditate moderată, în sensul în care proprietățile comparabile pot fi identificate și utilizate pentru fundamentarea valorii prin metoda comparației, însă prețul depinde sensibil de amplasament, suprafață, configurație și caracteristicile construcției. Prezența a trei comparabile în abordarea prin piață și a unui comparabil selectat pentru teren indică existența unor repere de piață suficiente pentru estimare, fără a presupune o piață abundent tranzacționată sau perfect omogenă.</w:t>
+        <w:t>Din perspectiva ofertei, proprietatile comparabile analizate reflecta o piata locala cu oferte eterogene, in care preturile sunt influentate de amplasament, dimensiunea terenului, suprafata utila si caracteristicile constructive. Valoarea terenului determinata prin comparatie este de 56.20 EUR/mp, respectiv 33,721.20 EUR pentru 600 mp, iar valoarea alocata constructiilor este de 101,923.80 EUR, ceea ce arata o contributie semnificativa a imbunatatirilor la formarea valorii de piata.</w:t>
         <w:br/>
         <w:br/>
-        <w:t>Tendințele pieței sunt reflectate de nivelul valorii obținute prin abordarea prin piață, respectiv de reconcilierea finală la 135645 EUR, valoare susținută de comparabilul selectat, în timp ce abordarea prin cost conduce la un nivel superior, ceea ce sugerează că piața nu capitalizează integral costul de înlocuire al construcției. Pentru teren, nivelul de 56.2020 EUR/mp utilizat în comparație confirmă existența unui reper de piață pentru loturi similare din zonă, iar alocarea valorii către construcții evidențiază contribuția semnificativă a îmbunătățirilor la valoarea totală a proprietății.</w:t>
+        <w:t>Lichiditatea pietei este apreciata ca moderata, in sensul ca proprietatile similare se pot tranzactiona intr-un interval rezonabil de timp atunci cand pretul este corelat cu nivelul pietei, insa procesul de absorbire depinde de gradul de potrivire intre caracteristicile proprietatii si preferintele cumparatorilor. In aceste conditii, abordarea prin piata a fost considerata cea mai relevanta, iar rezultatul reconcilierii, de 135,645.00 EUR, reflecta nivelul de pret sustinut de comparabilele selectate si de conditiile curente ale pietei locale.</w:t>
       </w:r>
     </w:p>
     <w:p>
@@ -302,13 +299,13 @@
     </w:p>
     <w:p>
       <w:r>
-        <w:t>Imobilul evaluat este identificat cadastral și în cartea funciară prin 20145, respectiv CF 20145 Comarnic, în conformitate cu documentația cadastrală și de publicitate imobiliară aferentă proprietății. Proprietatea este evaluată pentru scopul garantării creditului ipotecar, beneficiarul/finanțator fiind Banca Comerciala Exemplu S.A..</w:t>
+        <w:t>Imobilul analizat este individualizat prin identificatorii cadastrali și de carte funciară indicați în documentația pusă la dispoziție, respectiv 20145 și CF 20145 Comarnic, acestea reprezentând elementele de referință ale situației juridice a proprietății. Din punct de vedere juridic, proprietatea este evaluată în vederea garantării creditului ipotecar, pentru beneficiarul / finanțator Andrei Popescu – Banca Comerciala Exemplu S.A.</w:t>
         <w:br/>
         <w:br/>
-        <w:t>Din punct de vedere fizic, proprietatea este compusă din teren în suprafață de 600 mp, încadrat în categoria de folosință intravilan, pe care este edificată o construcție cu aria utilă de 128 mp și aria construită desfășurată de 162 mp. Anul de referință este 2026, iar regimul de înălțime nu a fost furnizat în datele disponibile.</w:t>
+        <w:t>Din punct de vedere fizic, proprietatea este compusă dintr-un teren intravilan în suprafață de 600 mp, pe care este amplasată o construcție cu arie utilă de 128 mp și arie construită desfășurată de 162 mp. Anul de referință al evaluării este 2026, iar descrierea tehnică a imobilului a fost realizată pe baza datelor numerice furnizate, fără alte completări din surse externe.</w:t>
         <w:br/>
         <w:br/>
-        <w:t>În cadrul evaluării, valoarea de piață estimată prin abordarea prin piață este de 135645.0000 EUR, iar prin abordarea prin cost valoarea rezultată este de 153471.60000 EUR. Prin comparație, terenul a fost evaluat la 56.2020 EUR/mp, rezultând o valoare a terenului de 33721.2000 EUR, iar valoarea alocată construcției este de 101923.8000 EUR.</w:t>
+        <w:t>În ansamblu, proprietatea evaluată prezintă caracteristicile specifice unui imobil rezidențial individualizat cadastral și tabular, cu teren aferent inclus în intravilan și construcție destinată utilizării curente, pentru care analiza valorii de piață a fost fundamentată pe datele disponibile privind terenul și construcția. Evaluarea a fost realizată de ing. Gabriela Fratila.</w:t>
       </w:r>
     </w:p>
     <w:p>
@@ -321,13 +318,13 @@
     </w:p>
     <w:p>
       <w:r>
-        <w:t>Analiza celei mai bune utilizări a proprietății a fost realizată prin raportare la criteriile SEV privind utilizarea rezonabilă, probabilă și legală, care este posibilă fizic, fezabilă financiar și maximum productivă. În cazul de față, având în vedere caracteristicile proprietății evaluate — teren intravilan în suprafață de 600 mp, pe care este edificată o construcție cu Arie utilă de 128 mp și Arie construită desfășurată de 162 mp — utilizarea rezidențială existentă reprezintă, în mod rezonabil, cea mai bună utilizare a imobilului.</w:t>
+        <w:t>Cea mai bună utilizare a proprietății imobiliare evaluate este utilizarea rezidențială existentă, aceasta îndeplinind cumulativ criteriile de permisibilitate legală, posibilitate fizică, fezabilitate financiară și maximum productivitate, conform conceptului CMBU aplicabil în evaluare. Proprietatea este constituită dintr-un teren intravilan în suprafață de 600 mp și o construcție cu arie utilă de 128 mp și arie construită desfășurată de 162 mp, elemente care susțin utilizarea actuală ca fiind una firească și adecvată caracteristicilor sale fizice.</w:t>
         <w:br/>
         <w:br/>
-        <w:t>Din punct de vedere al permisibilității legale, utilizarea rezidențială este compatibilă cu natura terenului intravilan și cu destinația curentă a îmbunătățirilor existente, nefiind identificate elemente care să impună o schimbare de funcțiune. Din punct de vedere al posibilității fizice, amplasamentul și dimensiunile terenului permit menținerea și exploatarea construcției existente în condiții obișnuite de utilizare rezidențială, fără a rezulta din datele disponibile o alternativă superioară din punct de vedere fizic.</w:t>
+        <w:t>Din punct de vedere legal și fizic, utilizarea rezidențială este compatibilă cu natura imobilului, fără a rezulta din datele disponibile indicii privind existența unor restricții care să impună o altă destinație ori să excludă utilizarea curentă. În plan economic, analizarea abordării prin cost indică o valoare prin cost de 153471.60 EUR, iar abordarea prin piață conduce la o valoare de 135645.00 EUR, ceea ce confirmă că proprietatea are o susținere valorică pe piață în configurația existentă, iar utilizarea rezidențială este fezabilă financiar.</w:t>
         <w:br/>
         <w:br/>
-        <w:t>Sub aspectul fezabilității financiare, abordarea prin piață conduce la o valoare finală reconciliată de 135645.0000 EUR, iar alocarea valorii indică 33721.2000 EUR pentru teren și 101923.8000 EUR pentru construcții, confirmând că imobilul generează valoare în configurația sa actuală. În raport cu abordarea prin cost, valoarea prin cost de 153471.60000 EUR este superioară valorii de piață, ceea ce susține concluzia că utilizarea existentă este susținută de piață și că, în condițiile analizate, aceasta este și maximum productivă, neexistând elemente care să indice o utilizare alternativă mai valoroasă decât utilizarea rezidențială curentă.</w:t>
+        <w:t>În cadrul analizei CMBU, dintre utilizările rezonabile și posibile, utilizarea actuală rezidențială este apreciată ca fiind și maximum productivă, întrucât nu există date care să susțină o alternativă de utilizare care să conducă la o valoare superioară în condițiile pieței analizate. Alocarea valorii prin metoda pieței evidențiază o valoare a terenului de 33721.20 EUR și o valoare alocată construcțiilor de 101923.80 EUR, ceea ce reflectă o structură valorică coerentă cu menținerea destinației rezidențiale existente.</w:t>
       </w:r>
     </w:p>
     <w:p>
@@ -414,7 +411,7 @@
           </w:tcPr>
           <w:p>
             <w:r>
-              <w:t>135098.0000</w:t>
+              <w:t>135098.00</w:t>
             </w:r>
           </w:p>
         </w:tc>
@@ -424,7 +421,7 @@
           </w:tcPr>
           <w:p>
             <w:r>
-              <w:t>0.1799467021985343104596935376</w:t>
+              <w:t>17.99%</w:t>
             </w:r>
           </w:p>
         </w:tc>
@@ -454,7 +451,7 @@
           </w:tcPr>
           <w:p>
             <w:r>
-              <w:t>135645.0000</w:t>
+              <w:t>135645.00</w:t>
             </w:r>
           </w:p>
         </w:tc>
@@ -464,7 +461,7 @@
           </w:tcPr>
           <w:p>
             <w:r>
-              <w:t>0.09447739065974796145292809489</w:t>
+              <w:t>9.45%</w:t>
             </w:r>
           </w:p>
         </w:tc>
@@ -496,7 +493,7 @@
           </w:tcPr>
           <w:p>
             <w:r>
-              <w:t>136128.0000</w:t>
+              <w:t>136128.00</w:t>
             </w:r>
           </w:p>
         </w:tc>
@@ -506,7 +503,7 @@
           </w:tcPr>
           <w:p>
             <w:r>
-              <w:t>0.2121146060417315478044222983</w:t>
+              <w:t>21.21%</w:t>
             </w:r>
           </w:p>
         </w:tc>
@@ -601,7 +598,7 @@
           </w:tcPr>
           <w:p>
             <w:r>
-              <w:t>56.2020</w:t>
+              <w:t>56.20</w:t>
             </w:r>
           </w:p>
         </w:tc>
@@ -611,7 +608,7 @@
           </w:tcPr>
           <w:p>
             <w:r>
-              <w:t>0.08</w:t>
+              <w:t>8.00%</w:t>
             </w:r>
           </w:p>
         </w:tc>
@@ -643,7 +640,7 @@
           </w:tcPr>
           <w:p>
             <w:r>
-              <w:t>55.9360</w:t>
+              <w:t>55.94</w:t>
             </w:r>
           </w:p>
         </w:tc>
@@ -653,7 +650,7 @@
           </w:tcPr>
           <w:p>
             <w:r>
-              <w:t>0.16</w:t>
+              <w:t>16.00%</w:t>
             </w:r>
           </w:p>
         </w:tc>
@@ -683,7 +680,7 @@
           </w:tcPr>
           <w:p>
             <w:r>
-              <w:t>50.2740</w:t>
+              <w:t>50.27</w:t>
             </w:r>
           </w:p>
         </w:tc>
@@ -693,7 +690,7 @@
           </w:tcPr>
           <w:p>
             <w:r>
-              <w:t>0.08</w:t>
+              <w:t>8.00%</w:t>
             </w:r>
           </w:p>
         </w:tc>
@@ -709,7 +706,7 @@
     </w:tbl>
     <w:p>
       <w:r>
-        <w:t>Valoarea terenului = 56.2020 EUR/mp x 600 mp = 33.721 EUR.</w:t>
+        <w:t>Valoarea terenului = 56.20 EUR/mp x 600 mp = 33.721 EUR.</w:t>
       </w:r>
     </w:p>
     <w:p>
@@ -809,7 +806,7 @@
           </w:tcPr>
           <w:p>
             <w:r>
-              <w:t>162</w:t>
+              <w:t>162.00</w:t>
             </w:r>
           </w:p>
         </w:tc>
@@ -819,7 +816,7 @@
           </w:tcPr>
           <w:p>
             <w:r>
-              <w:t>520</w:t>
+              <w:t>520.00</w:t>
             </w:r>
           </w:p>
         </w:tc>
@@ -829,7 +826,7 @@
           </w:tcPr>
           <w:p>
             <w:r>
-              <w:t>84240</w:t>
+              <w:t>84.240</w:t>
             </w:r>
           </w:p>
         </w:tc>
@@ -861,7 +858,7 @@
           </w:tcPr>
           <w:p>
             <w:r>
-              <w:t>162</w:t>
+              <w:t>162.00</w:t>
             </w:r>
           </w:p>
         </w:tc>
@@ -871,7 +868,7 @@
           </w:tcPr>
           <w:p>
             <w:r>
-              <w:t>360</w:t>
+              <w:t>360.00</w:t>
             </w:r>
           </w:p>
         </w:tc>
@@ -881,7 +878,7 @@
           </w:tcPr>
           <w:p>
             <w:r>
-              <w:t>58320</w:t>
+              <w:t>58.320</w:t>
             </w:r>
           </w:p>
         </w:tc>
@@ -889,18 +886,18 @@
     </w:tbl>
     <w:p>
       <w:r>
-        <w:t>CIB = 142.560; Vcp = 15.00 ani; depreciere fizica = 0.16000; CIN = 119.750; valoare prin cost (CIN + teren) = 153.472 EUR.</w:t>
+        <w:t>CIB = 142.560; Vcp = 15.00 ani; depreciere fizica = 16.00%; CIN = 119.750; valoare prin cost (CIN + teren) = 153.472 EUR.</w:t>
       </w:r>
     </w:p>
     <w:p>
       <w:r>
-        <w:t>În etapa de ajustare a grilei de piață, corecțiile au fost aplicate pornind de la diferențele dintre proprietatea evaluată și comparabilele selectate, astfel încât prețurile tranzacțiilor comparabile să fie aduse la un nivel cât mai apropiat de caracteristicile imobilului evaluat. În concordanță cu logica analizei pe perechi de date, ajustările urmăresc reflectarea diferențelor obiective de piață și de proprietate, iar în cadrul grilei au fost tratate distinct corecțiile aferente etapei de tranzacție față de cele aferente etapei de proprietate, pentru a păstra coerența relației dintre prețul comparabilului și valoarea estimată a proprietății evaluate.</w:t>
+        <w:t>Ajustările din grila de comparație au fost aplicate pentru a reflecta diferențele dintre fiecare comparabil și proprietatea subiect, în concordanță cu principiul substituției și cu cerința ca prețurile proprietăților comparabile să fie corectate în funcție de deosebirile existente între acestea și proprietatea evaluată. În etapa de tranzacție s-au avut în vedere diferențele de piață și de condiții ale ofertei/vânzării, astfel încât prețurile de tranzacție să poată fi aduse la un nivel comparabil cu cel al proprietății subiect. În etapa de proprietate au fost analizate caracteristicile intrinseci ale activului, precum amplasamentul, terenul de 600 mp, categoria de intravilan, suprafața utilă de 128 mp și aria construită desfășurată de 162 mp, pentru a surprinde diferențele de utilitate și atractivitate investițională față de comparabile.</w:t>
         <w:br/>
         <w:br/>
-        <w:t>Ajustările din etapa de tranzacție au rolul de a elimina influențele generate de condițiile vânzării, respectiv de particularitățile tranzacției comparabile, astfel încât comparația să se bazeze pe un preț echivalent de piață. Ulterior, ajustările din etapa de proprietate corectează diferențele de localizare, suprafață, caracteristici fizice și funcționale, precum și alte elemente relevante pentru comparabilitatea directă. Această succesiune este justificată de faptul că, în analiza prin comparație, evaluatorul pornește de la prețul tranzacției comparabile și aplică corecțiile necesare pentru a ajunge la estimarea valorii proprietății evaluate.</w:t>
+        <w:t>Logica aplicării ajustărilor urmărește separarea efectelor specifice pieței de efectele specifice proprietății, astfel încât comparația să fie realizată pe baze omogene și să conducă la o estimare credibilă a valorii de piață. În acest context, comparabilul selectat cu index 1 a fost considerat cel mai relevant deoarece a necesitat cea mai redusă ajustare brută în cadrul setului de 3 comparabile analizate, indicând cel mai înalt grad de similaritate globală față de proprietatea subiect. O ajustare brută minimă înseamnă, în mod metodologic, că diferențele identificate între comparabil și subiect sunt mai mici decât în cazul celorlalte alternative, ceea ce reduce gradul de corecție necesar pentru alinierea la caracteristicile proprietății evaluate.</w:t>
         <w:br/>
         <w:br/>
-        <w:t>Comparabilul selectat a fost acela cu ajustarea brută minimă, deoarece necesitatea unor corecții totale cât mai reduse indică cea mai bună similitudine față de proprietatea evaluată și, implicit, un grad mai ridicat de credibilitate în estimarea finală a valorii. În cazul de față, comparabilul de pe poziția 1 a fost ales ca rezultat al acestei selecții, întrucât a prezentat cel mai bun raport între apropierea de caracteristicile proprietății evaluate și nivelul total al ajustărilor impuse de grilă.</w:t>
+        <w:t>Valoarea terenului determinată prin comparație, de 56.20 EUR/mp, respectiv 33,721.20 EUR pentru 600 mp, a fost utilizată ca reper pentru separarea valorii terenului de valoarea construcțiilor, rezultând o valoare alocată construcțiilor de 101,923.80 EUR. Această structurare este compatibilă cu abordarea prin piață și susține reconcilierea finală la valoarea de 135,645.00 EUR, în condițiile scopului de garantare a creditului ipotecar și ale tipului de valoare de piață solicitat.</w:t>
       </w:r>
     </w:p>
     <w:p>
@@ -913,16 +910,16 @@
     </w:p>
     <w:p>
       <w:r>
-        <w:t xml:space="preserve">În fundamentarea concluziei asupra valorii, au fost analizate rezultatele obținute prin abordarea prin piață și prin abordarea prin cost, urmărindu-se selecția acelei indicații care reflectă cel mai bine condițiile concrete ale proprietății subiect și comportamentul probabil al pieței pentru un imobil evaluat în scopul garantării creditului ipotecar. Pentru tipul de valoare estimat, respectiv valoarea de piață, abordarea prin piață are relevanță prioritară, întrucât exprimă direct prețurile observate pentru proprietăți comparabile și reflectă cel mai fidel reacția participanților de pe piață. </w:t>
+        <w:t>Abordarea prin piață a fost considerată relevantă pentru estimarea valorii de piață în scopul garantării creditului ipotecar, întrucât reflectă comportamentul participanților la piață și conduce la o indicație directă de valoare pentru bunul evaluat, pe baza comparației cu active similare. În cadrul acestei abordări a fost selectat comparabilul index 1 dintr-un total de 3 comparabile, rezultând o valoare de 135645.00 EUR. Pentru teren, evaluarea prin comparație a condus la o valoare unitară de 56.20 EUR/mp, ceea ce, aplicat la suprafața de 600 mp, generează o valoare de 33721.20 EUR, iar diferența până la valoarea totală a fost alocată construcției, respectiv 101923.80 EUR.</w:t>
         <w:br/>
         <w:br/>
-        <w:t xml:space="preserve">Abordarea prin cost a condus la o valoare totală de 153471.60000 EUR, determinată prin cumularea valorii terenului de 33721.2000 EUR cu valoarea construcțiilor de 119750.40000 EUR, obținută prin aplicarea unei deprecieri fizice de 0.16000 la un cost de înlocuire brut de 142560 EUR, pentru o viață economică de 15.00 ani. Această abordare oferă o verificare utilă a ordinului de mărime, însă rezultatul său are un caracter mai degrabă complementar în raport cu piața, întrucât depinde de estimarea costurilor și a deprecierii, nu de tranzacțiile efective. </w:t>
+        <w:t>Abordarea prin cost a furnizat o indicație de 153471.60 EUR, determinată pe baza unui cost brut de înlocuire de 142560.00 EUR, a unei durate de viață economică de 15.00 ani și a unei deprecieri fizice de 16.00%, care au condus la un cost net de înlocuire de 119750.40 EUR. Această abordare evidențiază valoarea de înlocuire depreciată a proprietății, însă, în contextul scopului evaluării, are un caracter de control și de verificare a plauzibilității rezultatului obținut prin piață.</w:t>
         <w:br/>
         <w:br/>
-        <w:t xml:space="preserve">Abordarea prin piață a condus la valoarea de 135645.0000 EUR, rezultată din analiza comparabilelor de piață, cu selectarea comparabilului index 1 dintre cele 3 comparabile disponibile. Pentru teren, valoarea unitara de 56.2020 EUR/mp aplicată suprafeței de 600 mp a condus la o valoare de 33721.2000 EUR, iar valoarea alocată construcțiilor a fost de 101923.8000 EUR. În reconciliere, s-a acordat pondere determinantă abordării prin piață, întrucât aceasta este metoda cea mai adecvată pentru estimarea valorii de piață în contextul dat și cea mai apropiată de principiul substituției, corelat cu datele comparabile disponibile. </w:t>
+        <w:t>În procesul de reconciliere, valoarea rezultată din abordarea prin piață a fost reținută ca fiind cea mai adecvată, întrucât este susținută de date de tranzacționare/comparație și este direct ancorată în condițiile curente ale pieței pentru proprietăți similare. Ponderearea superioară acordată acestei metode este justificată de relevanța ei pentru tipul valorii solicitat și de faptul că, în cadrul acestui raport, ea oferă cea mai bună reflectare a prețului probabil de piață.</w:t>
         <w:br/>
         <w:br/>
-        <w:t>În consecință, valoarea finală reconciliată a proprietății imobiliare evaluată pentru Andrei Popescu, în vederea garantării creditului ipotecar în favoarea Banca Comerciala Exemplu S.A., este de 135645.0000 EUR, valoare rezultată prin abordarea prin piață și adoptată ca valoare de concluzie a evaluării.</w:t>
+        <w:t>În consecință, valoarea finală reconciliată a proprietății imobiliare evaluate, exprimată în condițiile date și pentru anul de referință 2026, este de 135645.00 EUR. Aceasta reprezintă opinia evaluatorului privind valoarea de piață a proprietății, în scopul garantării creditului ipotecar, pentru beneficiarul/finanțatorul Banca Comerciala Exemplu S.A..</w:t>
       </w:r>
     </w:p>
     <w:p>
@@ -1052,16 +1049,16 @@
     </w:p>
     <w:p>
       <w:r>
-        <w:t>Riscul asociat garantării creditului a fost analizat în contextul scopului evaluării, respectiv garantarea creditului ipotecar, având ca bază valoarea de piață estimată la 135645.0000 EUR pentru proprietatea situată pe un teren de 600 mp și o arie utilă de 128 mp. În accepțiunea GEV 520, o astfel de evaluare urmărește în special măsura în care creditorul își poate recupera expunerea prin preluarea și valorificarea garanției, iar analiza trebuie să reflecte condițiile pieței relevante, cererea pentru tipul de proprietate și potențialul de valorificare pe termen scurt.</w:t>
+        <w:t>Riscul asociat garantiei este apreciat ca fiind rezonabil, în raport cu scopul evaluării pentru garantarea creditului ipotecar, având în vedere că valoarea estimată reflectă valoarea de piață stabilită prin analiza comparabilelor, iar proprietatea are caracteristici uzuale pentru segmentul rezidențial/intravilan din piața locală. Conform GEV 520, analiza pentru garantare trebuie să țină seama de lichiditatea și activitatea pieței relevante, de cererea curentă și potențială pentru tipul de proprietate și de capacitatea acesteia de a fi valorificată în ipoteza unei executări silite.</w:t>
         <w:br/>
         <w:br/>
-        <w:t>Din perspectiva lichidității și a activității pieței locale, proprietatea prezintă o bază de analiză susținută de existența comparabilelor utilizate în abordarea prin piață, fiind selectat un comparabil relevant dintr-un set de 3 comparabile pentru estimarea valorii totale. Totodată, valoarea terenului a fost susținută prin comparație la nivelul de 56.2020 EUR/mp, rezultând 33721.2000 EUR pentru teren, ceea ce indică existența unei repere de piață pentru componenta funciară; în aceste condiții, garanția poate fi considerată vandabilă în condițiile unei expuneri obișnuite de piață, însă realizarea valorii depinde de menținerea cererii pentru proprietăți similare în zona analizată.</w:t>
+        <w:t>Din perspectiva adecvării ca garanție, proprietatea prezintă o structură funcțională care susține utilizarea ei ca activ de garanție, prin suprafața terenului de 600 mp, categoria de intravilan, respectiv prin Aria utilă de 128 mp și Aria construită desfășurată de 162 mp. Valoarea finală reconciliată de 135645.00 EUR, determinată prin abordarea prin piață, indică un nivel de piață susținut de un set de 3 comparabile, ceea ce oferă un suport suficient pentru estimarea valorii în contextul analizat. În același timp, valorile rezultate prin abordarea prin cost, respectiv 153471.60 EUR, confirmă existența unui suport economic al proprietății, însă pentru scopul garantării primează nivelul de piață rezultat prin comparare.</w:t>
         <w:br/>
         <w:br/>
-        <w:t>Sub aspectul gradului de adecvare al proprietății ca garanție, imobilul este corespunzător utilizării ca garanție ipotecară, întrucât are o valoare de piață determinată printr-o abordare de piață și o structură de valoare separabilă între teren și construcții. Valoarea alocată construcțiilor este de 101923.8000 EUR, iar valoarea prin cost este de 153471.60000 EUR, aspecte care confirmă existența unui activ suficient de identificabil și evaluabil, cu o componentă de teren distinctă și o componentă construită semnificativă, relevante pentru creditor în eventualitatea executării garanției.</w:t>
+        <w:t>În ceea ce privește vandabilitatea, proprietatea poate fi considerată relativ lichidă în măsura în care se încadrează într-un segment obișnuit al pieței imobiliare locale, însă realizarea valorii depinde de condițiile concrete ale pieței la momentul valorificării, inclusiv de ritmul tranzacțiilor și de nivelul cererii pentru proprietăți similare. Evaluarea terenului la 56.20 EUR/mp, cu o valoare aferentă de 33721.20 EUR, arată că o parte distinctă din valoarea garanției este susținută de componenta funciară, ceea ce reduce parțial expunerea la riscul de depreciere specifică construcției.</w:t>
         <w:br/>
         <w:br/>
-        <w:t>În ceea ce privește sensibilitatea valorii la condițiile pieței, valoarea finală reconciliată de 135645.0000 EUR trebuie privită ca fiind dependentă de evoluția cererii locale, de nivelul prețurilor pentru proprietăți similare și de timpul necesar valorificării. Întrucât GEV 520 cere comentarea factorilor relevanți pentru performanța garanției pe perioada creditului, se apreciază că expunerea estimată a finanțatorului, Banca Comerciala Exemplu S.A., este rezonabil susținută de valoarea de piață rezultată, dar rămâne sensibilă la eventuale ajustări ale condițiilor pieței, la variația lichidității segmentului imobiliar analizat și la eventualele diferențe între valoarea estimată și prețul obținut efectiv la vânzarea forțată sau în condiții de expunere limitată.</w:t>
+        <w:t>Expunerea estimată a creditorului trebuie raportată la valoarea de piață de 135645.00 EUR, în condițiile în care valoarea garanției poate varia odată cu evoluția cererii, a lichidității locale și a percepției cumpărătorilor asupra proprietăților similare. Sensibilitatea valorii la condițiile pieței este moderată, întrucât proprietatea are o utilizare clară, o evaluare fundamentată pe comparabile și o structură valorică alocată între teren și construcție de 33721.20 EUR și, respectiv, 101923.80 EUR; totuși, eventualele ajustări ale prețurilor de piață pot afecta direct capacitatea de recuperare a băncii creditoare, Banca Comerciala Exemplu S.A., în scenariul unei valorificări forțate.</w:t>
       </w:r>
     </w:p>
     <w:p>

</xml_diff>